<commit_message>
Continue the New York Flankees
</commit_message>
<xml_diff>
--- a/THM_challenges/Medium/New York Flankees/New_York_Flankees_Solution_Documentation.docx
+++ b/THM_challenges/Medium/New York Flankees/New_York_Flankees_Solution_Documentation.docx
@@ -125,6 +125,9 @@
     </w:p>
     <w:p>
       <w:r>
+        <w:rPr>
+          <w:noProof/>
+        </w:rPr>
         <w:drawing>
           <wp:inline distT="0" distB="0" distL="0" distR="0" wp14:anchorId="513D6F0B" wp14:editId="38F1FFAF">
             <wp:extent cx="4945380" cy="2454836"/>
@@ -199,6 +202,9 @@
         </w:rPr>
       </w:pPr>
       <w:r>
+        <w:rPr>
+          <w:noProof/>
+        </w:rPr>
         <w:drawing>
           <wp:inline distT="0" distB="0" distL="0" distR="0" wp14:anchorId="16A0A0DA" wp14:editId="734FDBB8">
             <wp:extent cx="3403512" cy="3025140"/>
@@ -255,6 +261,9 @@
     </w:p>
     <w:p>
       <w:r>
+        <w:rPr>
+          <w:noProof/>
+        </w:rPr>
         <w:drawing>
           <wp:inline distT="0" distB="0" distL="0" distR="0" wp14:anchorId="343D0B84" wp14:editId="6D954FD9">
             <wp:extent cx="4557712" cy="2298905"/>
@@ -295,6 +304,59 @@
     <w:p>
       <w:r>
         <w:lastRenderedPageBreak/>
+        <w:t>I tried to enter some false credentials to see in Burpsuite how to login request looks like:</w:t>
+      </w:r>
+    </w:p>
+    <w:p>
+      <w:r>
+        <w:drawing>
+          <wp:inline distT="0" distB="0" distL="0" distR="0" wp14:anchorId="4FE0E142" wp14:editId="012E7AD2">
+            <wp:extent cx="4370449" cy="1333616"/>
+            <wp:effectExtent l="0" t="0" r="0" b="0"/>
+            <wp:docPr id="724824879" name="תמונה 1"/>
+            <wp:cNvGraphicFramePr>
+              <a:graphicFrameLocks xmlns:a="http://schemas.openxmlformats.org/drawingml/2006/main" noChangeAspect="1"/>
+            </wp:cNvGraphicFramePr>
+            <a:graphic xmlns:a="http://schemas.openxmlformats.org/drawingml/2006/main">
+              <a:graphicData uri="http://schemas.openxmlformats.org/drawingml/2006/picture">
+                <pic:pic xmlns:pic="http://schemas.openxmlformats.org/drawingml/2006/picture">
+                  <pic:nvPicPr>
+                    <pic:cNvPr id="724824879" name=""/>
+                    <pic:cNvPicPr/>
+                  </pic:nvPicPr>
+                  <pic:blipFill>
+                    <a:blip r:embed="rId7"/>
+                    <a:stretch>
+                      <a:fillRect/>
+                    </a:stretch>
+                  </pic:blipFill>
+                  <pic:spPr>
+                    <a:xfrm>
+                      <a:off x="0" y="0"/>
+                      <a:ext cx="4370449" cy="1333616"/>
+                    </a:xfrm>
+                    <a:prstGeom prst="rect">
+                      <a:avLst/>
+                    </a:prstGeom>
+                  </pic:spPr>
+                </pic:pic>
+              </a:graphicData>
+            </a:graphic>
+          </wp:inline>
+        </w:drawing>
+      </w:r>
+    </w:p>
+    <w:p>
+      <w:r>
+        <w:t xml:space="preserve">After releasing the packet, I returned to the webpage and found that it led to </w:t>
+      </w:r>
+      <w:r>
+        <w:t>error 401.</w:t>
+      </w:r>
+    </w:p>
+    <w:p/>
+    <w:p>
+      <w:r>
         <w:t xml:space="preserve">Now I </w:t>
       </w:r>
       <w:r>
@@ -318,6 +380,9 @@
     </w:p>
     <w:p>
       <w:r>
+        <w:rPr>
+          <w:noProof/>
+        </w:rPr>
         <w:drawing>
           <wp:inline distT="0" distB="0" distL="0" distR="0" wp14:anchorId="49057717" wp14:editId="71B67F66">
             <wp:extent cx="7296782" cy="2267146"/>
@@ -334,7 +399,7 @@
                     <pic:cNvPicPr/>
                   </pic:nvPicPr>
                   <pic:blipFill>
-                    <a:blip r:embed="rId7"/>
+                    <a:blip r:embed="rId8"/>
                     <a:stretch>
                       <a:fillRect/>
                     </a:stretch>
@@ -357,6 +422,11 @@
     </w:p>
     <w:p>
       <w:r>
+        <w:t>I understood that there are 2 problems that should be fix to make the program work</w:t>
+      </w:r>
+    </w:p>
+    <w:p>
+      <w:r>
         <w:t xml:space="preserve">I </w:t>
       </w:r>
       <w:r>
@@ -371,6 +441,9 @@
     </w:p>
     <w:p>
       <w:r>
+        <w:rPr>
+          <w:noProof/>
+        </w:rPr>
         <w:drawing>
           <wp:inline distT="0" distB="0" distL="0" distR="0" wp14:anchorId="049932FF" wp14:editId="5D5D3144">
             <wp:extent cx="7556500" cy="1381760"/>
@@ -387,7 +460,7 @@
                     <pic:cNvPicPr/>
                   </pic:nvPicPr>
                   <pic:blipFill>
-                    <a:blip r:embed="rId8"/>
+                    <a:blip r:embed="rId9"/>
                     <a:stretch>
                       <a:fillRect/>
                     </a:stretch>
@@ -409,18 +482,148 @@
       </w:r>
     </w:p>
     <w:p>
+      <w:r>
+        <w:t xml:space="preserve">After reading it a bit I understood that </w:t>
+      </w:r>
+      <w:r>
+        <w:t xml:space="preserve">I should complete this function in order to make it return the authentication token. I tried to enter the full path </w:t>
+      </w:r>
+      <w:r>
+        <w:t>provided by the function which returned my this message:</w:t>
+      </w:r>
+    </w:p>
+    <w:p>
       <w:pPr>
         <w:rPr>
-          <w:rFonts w:hint="cs"/>
           <w:rtl/>
         </w:rPr>
       </w:pPr>
       <w:r>
-        <w:t xml:space="preserve">After reading it a bit I understood that </w:t>
-      </w:r>
-    </w:p>
-    <w:p/>
-    <w:p/>
+        <w:drawing>
+          <wp:inline distT="0" distB="0" distL="0" distR="0" wp14:anchorId="7A17371E" wp14:editId="7FABECD4">
+            <wp:extent cx="7556500" cy="395605"/>
+            <wp:effectExtent l="0" t="0" r="6350" b="4445"/>
+            <wp:docPr id="1596749866" name="תמונה 1"/>
+            <wp:cNvGraphicFramePr>
+              <a:graphicFrameLocks xmlns:a="http://schemas.openxmlformats.org/drawingml/2006/main" noChangeAspect="1"/>
+            </wp:cNvGraphicFramePr>
+            <a:graphic xmlns:a="http://schemas.openxmlformats.org/drawingml/2006/main">
+              <a:graphicData uri="http://schemas.openxmlformats.org/drawingml/2006/picture">
+                <pic:pic xmlns:pic="http://schemas.openxmlformats.org/drawingml/2006/picture">
+                  <pic:nvPicPr>
+                    <pic:cNvPr id="1596749866" name=""/>
+                    <pic:cNvPicPr/>
+                  </pic:nvPicPr>
+                  <pic:blipFill>
+                    <a:blip r:embed="rId10"/>
+                    <a:stretch>
+                      <a:fillRect/>
+                    </a:stretch>
+                  </pic:blipFill>
+                  <pic:spPr>
+                    <a:xfrm>
+                      <a:off x="0" y="0"/>
+                      <a:ext cx="7556500" cy="395605"/>
+                    </a:xfrm>
+                    <a:prstGeom prst="rect">
+                      <a:avLst/>
+                    </a:prstGeom>
+                  </pic:spPr>
+                </pic:pic>
+              </a:graphicData>
+            </a:graphic>
+          </wp:inline>
+        </w:drawing>
+      </w:r>
+    </w:p>
+    <w:p>
+      <w:r>
+        <w:t xml:space="preserve">At this point, I mistakenly deleted one on the </w:t>
+      </w:r>
+      <w:r>
+        <w:t>characters of the token which led me to this message:</w:t>
+      </w:r>
+    </w:p>
+    <w:p>
+      <w:r>
+        <w:drawing>
+          <wp:inline distT="0" distB="0" distL="0" distR="0" wp14:anchorId="67973B82" wp14:editId="6968D7D6">
+            <wp:extent cx="7556500" cy="396240"/>
+            <wp:effectExtent l="0" t="0" r="6350" b="3810"/>
+            <wp:docPr id="479928981" name="תמונה 1"/>
+            <wp:cNvGraphicFramePr>
+              <a:graphicFrameLocks xmlns:a="http://schemas.openxmlformats.org/drawingml/2006/main" noChangeAspect="1"/>
+            </wp:cNvGraphicFramePr>
+            <a:graphic xmlns:a="http://schemas.openxmlformats.org/drawingml/2006/main">
+              <a:graphicData uri="http://schemas.openxmlformats.org/drawingml/2006/picture">
+                <pic:pic xmlns:pic="http://schemas.openxmlformats.org/drawingml/2006/picture">
+                  <pic:nvPicPr>
+                    <pic:cNvPr id="479928981" name=""/>
+                    <pic:cNvPicPr/>
+                  </pic:nvPicPr>
+                  <pic:blipFill>
+                    <a:blip r:embed="rId11"/>
+                    <a:stretch>
+                      <a:fillRect/>
+                    </a:stretch>
+                  </pic:blipFill>
+                  <pic:spPr>
+                    <a:xfrm>
+                      <a:off x="0" y="0"/>
+                      <a:ext cx="7556500" cy="396240"/>
+                    </a:xfrm>
+                    <a:prstGeom prst="rect">
+                      <a:avLst/>
+                    </a:prstGeom>
+                  </pic:spPr>
+                </pic:pic>
+              </a:graphicData>
+            </a:graphic>
+          </wp:inline>
+        </w:drawing>
+      </w:r>
+    </w:p>
+    <w:p>
+      <w:r>
+        <w:t xml:space="preserve">I realized </w:t>
+      </w:r>
+      <w:r>
+        <w:t>this</w:t>
+      </w:r>
+      <w:r>
+        <w:t xml:space="preserve"> token is probably </w:t>
+      </w:r>
+      <w:r>
+        <w:t>an</w:t>
+      </w:r>
+      <w:r>
+        <w:t xml:space="preserve"> encryption and this message returned because the website tried to decrypt the </w:t>
+      </w:r>
+      <w:r>
+        <w:t>token without success.</w:t>
+      </w:r>
+    </w:p>
+    <w:p>
+      <w:r>
+        <w:lastRenderedPageBreak/>
+        <w:t xml:space="preserve">I </w:t>
+      </w:r>
+      <w:r>
+        <w:t xml:space="preserve">returned to the </w:t>
+      </w:r>
+      <w:r>
+        <w:t xml:space="preserve">debug page and </w:t>
+      </w:r>
+      <w:r>
+        <w:t>searched a little about the second problem of: “</w:t>
+      </w:r>
+      <w:r>
+        <w:t>verbose error related to padding</w:t>
+      </w:r>
+      <w:r>
+        <w:t xml:space="preserve">” on the internet. I found </w:t>
+      </w:r>
+    </w:p>
     <w:sectPr>
       <w:pgSz w:w="12240" w:h="15840"/>
       <w:pgMar w:top="170" w:right="170" w:bottom="170" w:left="170" w:header="720" w:footer="720" w:gutter="0"/>
@@ -1035,7 +1238,6 @@
   <w:style w:type="character" w:default="1" w:styleId="a0">
     <w:name w:val="Default Paragraph Font"/>
     <w:uiPriority w:val="1"/>
-    <w:semiHidden/>
     <w:unhideWhenUsed/>
   </w:style>
   <w:style w:type="table" w:default="1" w:styleId="a1">

</xml_diff>

<commit_message>
Continue the New York Flankees thm ctf
</commit_message>
<xml_diff>
--- a/THM_challenges/Medium/New York Flankees/New_York_Flankees_Solution_Documentation.docx
+++ b/THM_challenges/Medium/New York Flankees/New_York_Flankees_Solution_Documentation.docx
@@ -144,7 +144,7 @@
                     <pic:cNvPicPr/>
                   </pic:nvPicPr>
                   <pic:blipFill>
-                    <a:blip r:embed="rId4"/>
+                    <a:blip r:embed="rId5"/>
                     <a:stretch>
                       <a:fillRect/>
                     </a:stretch>
@@ -221,7 +221,7 @@
                     <pic:cNvPicPr/>
                   </pic:nvPicPr>
                   <pic:blipFill>
-                    <a:blip r:embed="rId5"/>
+                    <a:blip r:embed="rId6"/>
                     <a:stretch>
                       <a:fillRect/>
                     </a:stretch>
@@ -280,7 +280,7 @@
                     <pic:cNvPicPr/>
                   </pic:nvPicPr>
                   <pic:blipFill>
-                    <a:blip r:embed="rId6"/>
+                    <a:blip r:embed="rId7"/>
                     <a:stretch>
                       <a:fillRect/>
                     </a:stretch>
@@ -309,6 +309,9 @@
     </w:p>
     <w:p>
       <w:r>
+        <w:rPr>
+          <w:noProof/>
+        </w:rPr>
         <w:drawing>
           <wp:inline distT="0" distB="0" distL="0" distR="0" wp14:anchorId="4FE0E142" wp14:editId="012E7AD2">
             <wp:extent cx="4370449" cy="1333616"/>
@@ -325,7 +328,7 @@
                     <pic:cNvPicPr/>
                   </pic:nvPicPr>
                   <pic:blipFill>
-                    <a:blip r:embed="rId7"/>
+                    <a:blip r:embed="rId8"/>
                     <a:stretch>
                       <a:fillRect/>
                     </a:stretch>
@@ -399,7 +402,7 @@
                     <pic:cNvPicPr/>
                   </pic:nvPicPr>
                   <pic:blipFill>
-                    <a:blip r:embed="rId8"/>
+                    <a:blip r:embed="rId9"/>
                     <a:stretch>
                       <a:fillRect/>
                     </a:stretch>
@@ -422,7 +425,15 @@
     </w:p>
     <w:p>
       <w:r>
-        <w:t>I understood that there are 2 problems that should be fix to make the program work</w:t>
+        <w:t xml:space="preserve">I understood that there are 2 problems that should be </w:t>
+      </w:r>
+      <w:proofErr w:type="gramStart"/>
+      <w:r>
+        <w:t>fix</w:t>
+      </w:r>
+      <w:proofErr w:type="gramEnd"/>
+      <w:r>
+        <w:t xml:space="preserve"> to make the program work</w:t>
       </w:r>
     </w:p>
     <w:p>
@@ -460,7 +471,7 @@
                     <pic:cNvPicPr/>
                   </pic:nvPicPr>
                   <pic:blipFill>
-                    <a:blip r:embed="rId9"/>
+                    <a:blip r:embed="rId10"/>
                     <a:stretch>
                       <a:fillRect/>
                     </a:stretch>
@@ -489,7 +500,15 @@
         <w:t xml:space="preserve">I should complete this function in order to make it return the authentication token. I tried to enter the full path </w:t>
       </w:r>
       <w:r>
-        <w:t>provided by the function which returned my this message:</w:t>
+        <w:t xml:space="preserve">provided by the function which returned </w:t>
+      </w:r>
+      <w:proofErr w:type="gramStart"/>
+      <w:r>
+        <w:t>my this</w:t>
+      </w:r>
+      <w:proofErr w:type="gramEnd"/>
+      <w:r>
+        <w:t xml:space="preserve"> message:</w:t>
       </w:r>
     </w:p>
     <w:p>
@@ -499,6 +518,9 @@
         </w:rPr>
       </w:pPr>
       <w:r>
+        <w:rPr>
+          <w:noProof/>
+        </w:rPr>
         <w:drawing>
           <wp:inline distT="0" distB="0" distL="0" distR="0" wp14:anchorId="7A17371E" wp14:editId="7FABECD4">
             <wp:extent cx="7556500" cy="395605"/>
@@ -515,7 +537,7 @@
                     <pic:cNvPicPr/>
                   </pic:nvPicPr>
                   <pic:blipFill>
-                    <a:blip r:embed="rId10"/>
+                    <a:blip r:embed="rId11"/>
                     <a:stretch>
                       <a:fillRect/>
                     </a:stretch>
@@ -546,6 +568,9 @@
     </w:p>
     <w:p>
       <w:r>
+        <w:rPr>
+          <w:noProof/>
+        </w:rPr>
         <w:drawing>
           <wp:inline distT="0" distB="0" distL="0" distR="0" wp14:anchorId="67973B82" wp14:editId="6968D7D6">
             <wp:extent cx="7556500" cy="396240"/>
@@ -562,7 +587,7 @@
                     <pic:cNvPicPr/>
                   </pic:nvPicPr>
                   <pic:blipFill>
-                    <a:blip r:embed="rId11"/>
+                    <a:blip r:embed="rId12"/>
                     <a:stretch>
                       <a:fillRect/>
                     </a:stretch>
@@ -621,9 +646,202 @@
         <w:t>verbose error related to padding</w:t>
       </w:r>
       <w:r>
-        <w:t xml:space="preserve">” on the internet. I found </w:t>
-      </w:r>
-    </w:p>
+        <w:t>” on the internet. I fou</w:t>
+      </w:r>
+      <w:r>
+        <w:t>nd that this issue related to an attack named “oracle padding”.</w:t>
+      </w:r>
+      <w:r>
+        <w:t xml:space="preserve"> In short</w:t>
+      </w:r>
+      <w:r>
+        <w:t>,</w:t>
+      </w:r>
+      <w:r>
+        <w:t xml:space="preserve"> when CBC encryption mode is use</w:t>
+      </w:r>
+      <w:r>
+        <w:t xml:space="preserve">d to encrypt a message it splits an entire message to equal length blocks </w:t>
+      </w:r>
+      <w:r>
+        <w:t>(The block sized is determined according the encryption method)</w:t>
+      </w:r>
+      <w:r>
+        <w:t xml:space="preserve"> </w:t>
+      </w:r>
+      <w:r>
+        <w:t xml:space="preserve">in order to perform encryption on each </w:t>
+      </w:r>
+      <w:r>
+        <w:t>individually</w:t>
+      </w:r>
+      <w:r>
+        <w:t xml:space="preserve"> plus implementing a XOR operation over the pervious </w:t>
+      </w:r>
+      <w:r>
+        <w:t>encrypted block with the current (pre-encrypted) block.</w:t>
+      </w:r>
+      <w:r>
+        <w:t xml:space="preserve"> The problem with doing such a thing is that usually the message’s size doesn’t</w:t>
+      </w:r>
+      <w:r>
+        <w:t xml:space="preserve"> split equally with the block size with means that the last block should be added some characters in order to make it fit. </w:t>
+      </w:r>
+      <w:r>
+        <w:t>The process of adding these</w:t>
+      </w:r>
+      <w:r>
+        <w:t xml:space="preserve"> </w:t>
+      </w:r>
+      <w:r>
+        <w:t xml:space="preserve">additional characters </w:t>
+      </w:r>
+      <w:r>
+        <w:t>called “padding”</w:t>
+      </w:r>
+      <w:r>
+        <w:t>.</w:t>
+      </w:r>
+      <w:r>
+        <w:t xml:space="preserve"> Now, </w:t>
+      </w:r>
+      <w:r>
+        <w:t xml:space="preserve">if </w:t>
+      </w:r>
+      <w:r>
+        <w:t xml:space="preserve">the </w:t>
+      </w:r>
+      <w:r>
+        <w:t xml:space="preserve">encrypted block is based on the previous one it’s possible to </w:t>
+      </w:r>
+      <w:r>
+        <w:t>decrypt the</w:t>
+      </w:r>
+      <w:r>
+        <w:t xml:space="preserve"> entire</w:t>
+      </w:r>
+      <w:r>
+        <w:t xml:space="preserve"> </w:t>
+      </w:r>
+      <w:r>
+        <w:t>message without knowing the encryption key</w:t>
+      </w:r>
+      <w:r>
+        <w:t xml:space="preserve"> </w:t>
+      </w:r>
+      <w:r>
+        <w:t xml:space="preserve">using </w:t>
+      </w:r>
+      <w:r>
+        <w:t>the padding characters</w:t>
+      </w:r>
+      <w:r>
+        <w:t xml:space="preserve"> and the XOR opera</w:t>
+      </w:r>
+      <w:r>
+        <w:t>tion.</w:t>
+      </w:r>
+    </w:p>
+    <w:p>
+      <w:r>
+        <w:t xml:space="preserve">I searched for a tool that can help me exploit this vulnerability and </w:t>
+      </w:r>
+      <w:r>
+        <w:t>execute th</w:t>
+      </w:r>
+      <w:r>
+        <w:t xml:space="preserve">is attack and I found one named “padre” on </w:t>
+      </w:r>
+      <w:r>
+        <w:t>GitHub</w:t>
+      </w:r>
+      <w:r>
+        <w:t>:</w:t>
+      </w:r>
+      <w:r>
+        <w:t xml:space="preserve"> </w:t>
+      </w:r>
+      <w:r>
+        <w:t>https://github.com/glebarez/padre/releases/tag/v2.1.0</w:t>
+      </w:r>
+    </w:p>
+    <w:p>
+      <w:r>
+        <w:t xml:space="preserve">I </w:t>
+      </w:r>
+      <w:r>
+        <w:t>downloaded</w:t>
+      </w:r>
+      <w:r>
+        <w:t xml:space="preserve"> it</w:t>
+      </w:r>
+      <w:r>
+        <w:t xml:space="preserve"> and run </w:t>
+      </w:r>
+      <w:r>
+        <w:t>it’s help menu:</w:t>
+      </w:r>
+    </w:p>
+    <w:p>
+      <w:r>
+        <w:rPr>
+          <w:noProof/>
+        </w:rPr>
+        <w:drawing>
+          <wp:inline distT="0" distB="0" distL="0" distR="0" wp14:anchorId="3E5A3F84" wp14:editId="080817E6">
+            <wp:extent cx="5013960" cy="3549799"/>
+            <wp:effectExtent l="0" t="0" r="0" b="0"/>
+            <wp:docPr id="561994931" name="תמונה 1"/>
+            <wp:cNvGraphicFramePr>
+              <a:graphicFrameLocks xmlns:a="http://schemas.openxmlformats.org/drawingml/2006/main" noChangeAspect="1"/>
+            </wp:cNvGraphicFramePr>
+            <a:graphic xmlns:a="http://schemas.openxmlformats.org/drawingml/2006/main">
+              <a:graphicData uri="http://schemas.openxmlformats.org/drawingml/2006/picture">
+                <pic:pic xmlns:pic="http://schemas.openxmlformats.org/drawingml/2006/picture">
+                  <pic:nvPicPr>
+                    <pic:cNvPr id="561994931" name=""/>
+                    <pic:cNvPicPr/>
+                  </pic:nvPicPr>
+                  <pic:blipFill>
+                    <a:blip r:embed="rId13"/>
+                    <a:stretch>
+                      <a:fillRect/>
+                    </a:stretch>
+                  </pic:blipFill>
+                  <pic:spPr>
+                    <a:xfrm>
+                      <a:off x="0" y="0"/>
+                      <a:ext cx="5020777" cy="3554625"/>
+                    </a:xfrm>
+                    <a:prstGeom prst="rect">
+                      <a:avLst/>
+                    </a:prstGeom>
+                  </pic:spPr>
+                </pic:pic>
+              </a:graphicData>
+            </a:graphic>
+          </wp:inline>
+        </w:drawing>
+      </w:r>
+    </w:p>
+    <w:p>
+      <w:r>
+        <w:t xml:space="preserve">*I must say that </w:t>
+      </w:r>
+      <w:r>
+        <w:t>compared</w:t>
+      </w:r>
+      <w:r>
+        <w:t xml:space="preserve"> to other tools it looks and </w:t>
+      </w:r>
+      <w:r>
+        <w:t>operates</w:t>
+      </w:r>
+      <w:r>
+        <w:t xml:space="preserve"> very good.</w:t>
+      </w:r>
+    </w:p>
+    <w:p/>
     <w:sectPr>
       <w:pgSz w:w="12240" w:h="15840"/>
       <w:pgMar w:top="170" w:right="170" w:bottom="170" w:left="170" w:header="720" w:footer="720" w:gutter="0"/>
@@ -633,6 +851,126 @@
     </w:sectPr>
   </w:body>
 </w:document>
+</file>
+
+<file path=word/numbering.xml><?xml version="1.0" encoding="utf-8"?>
+<w:numbering xmlns:wpc="http://schemas.microsoft.com/office/word/2010/wordprocessingCanvas" xmlns:cx="http://schemas.microsoft.com/office/drawing/2014/chartex" xmlns:cx1="http://schemas.microsoft.com/office/drawing/2015/9/8/chartex" xmlns:cx2="http://schemas.microsoft.com/office/drawing/2015/10/21/chartex" xmlns:cx3="http://schemas.microsoft.com/office/drawing/2016/5/9/chartex" xmlns:cx4="http://schemas.microsoft.com/office/drawing/2016/5/10/chartex" xmlns:cx5="http://schemas.microsoft.com/office/drawing/2016/5/11/chartex" xmlns:cx6="http://schemas.microsoft.com/office/drawing/2016/5/12/chartex" xmlns:cx7="http://schemas.microsoft.com/office/drawing/2016/5/13/chartex" xmlns:cx8="http://schemas.microsoft.com/office/drawing/2016/5/14/chartex" xmlns:mc="http://schemas.openxmlformats.org/markup-compatibility/2006" xmlns:aink="http://schemas.microsoft.com/office/drawing/2016/ink" xmlns:am3d="http://schemas.microsoft.com/office/drawing/2017/model3d" xmlns:o="urn:schemas-microsoft-com:office:office" xmlns:oel="http://schemas.microsoft.com/office/2019/extlst" xmlns:r="http://schemas.openxmlformats.org/officeDocument/2006/relationships" xmlns:m="http://schemas.openxmlformats.org/officeDocument/2006/math" xmlns:v="urn:schemas-microsoft-com:vml" xmlns:wp14="http://schemas.microsoft.com/office/word/2010/wordprocessingDrawing" xmlns:wp="http://schemas.openxmlformats.org/drawingml/2006/wordprocessingDrawing" xmlns:w10="urn:schemas-microsoft-com:office:word" xmlns:w="http://schemas.openxmlformats.org/wordprocessingml/2006/main" xmlns:w14="http://schemas.microsoft.com/office/word/2010/wordml" xmlns:w15="http://schemas.microsoft.com/office/word/2012/wordml" xmlns:w16cex="http://schemas.microsoft.com/office/word/2018/wordml/cex" xmlns:w16cid="http://schemas.microsoft.com/office/word/2016/wordml/cid" xmlns:w16="http://schemas.microsoft.com/office/word/2018/wordml" xmlns:w16du="http://schemas.microsoft.com/office/word/2023/wordml/word16du" xmlns:w16sdtdh="http://schemas.microsoft.com/office/word/2020/wordml/sdtdatahash" xmlns:w16sdtfl="http://schemas.microsoft.com/office/word/2024/wordml/sdtformatlock" xmlns:w16se="http://schemas.microsoft.com/office/word/2015/wordml/symex" xmlns:wpg="http://schemas.microsoft.com/office/word/2010/wordprocessingGroup" xmlns:wpi="http://schemas.microsoft.com/office/word/2010/wordprocessingInk" xmlns:wne="http://schemas.microsoft.com/office/word/2006/wordml" xmlns:wps="http://schemas.microsoft.com/office/word/2010/wordprocessingShape" mc:Ignorable="w14 w15 w16se w16cid w16 w16cex w16sdtdh w16sdtfl w16du wp14">
+  <w:abstractNum w:abstractNumId="0" w15:restartNumberingAfterBreak="0">
+    <w:nsid w:val="073955C9"/>
+    <w:multiLevelType w:val="hybridMultilevel"/>
+    <w:tmpl w:val="7B16566C"/>
+    <w:lvl w:ilvl="0" w:tplc="7F8C8F8C">
+      <w:numFmt w:val="bullet"/>
+      <w:lvlText w:val=""/>
+      <w:lvlJc w:val="left"/>
+      <w:pPr>
+        <w:ind w:left="720" w:hanging="360"/>
+      </w:pPr>
+      <w:rPr>
+        <w:rFonts w:ascii="Symbol" w:eastAsiaTheme="minorHAnsi" w:hAnsi="Symbol" w:cstheme="minorBidi" w:hint="default"/>
+      </w:rPr>
+    </w:lvl>
+    <w:lvl w:ilvl="1" w:tplc="04090003" w:tentative="1">
+      <w:start w:val="1"/>
+      <w:numFmt w:val="bullet"/>
+      <w:lvlText w:val="o"/>
+      <w:lvlJc w:val="left"/>
+      <w:pPr>
+        <w:ind w:left="1440" w:hanging="360"/>
+      </w:pPr>
+      <w:rPr>
+        <w:rFonts w:ascii="Courier New" w:hAnsi="Courier New" w:cs="Courier New" w:hint="default"/>
+      </w:rPr>
+    </w:lvl>
+    <w:lvl w:ilvl="2" w:tplc="04090005" w:tentative="1">
+      <w:start w:val="1"/>
+      <w:numFmt w:val="bullet"/>
+      <w:lvlText w:val=""/>
+      <w:lvlJc w:val="left"/>
+      <w:pPr>
+        <w:ind w:left="2160" w:hanging="360"/>
+      </w:pPr>
+      <w:rPr>
+        <w:rFonts w:ascii="Wingdings" w:hAnsi="Wingdings" w:hint="default"/>
+      </w:rPr>
+    </w:lvl>
+    <w:lvl w:ilvl="3" w:tplc="04090001" w:tentative="1">
+      <w:start w:val="1"/>
+      <w:numFmt w:val="bullet"/>
+      <w:lvlText w:val=""/>
+      <w:lvlJc w:val="left"/>
+      <w:pPr>
+        <w:ind w:left="2880" w:hanging="360"/>
+      </w:pPr>
+      <w:rPr>
+        <w:rFonts w:ascii="Symbol" w:hAnsi="Symbol" w:hint="default"/>
+      </w:rPr>
+    </w:lvl>
+    <w:lvl w:ilvl="4" w:tplc="04090003" w:tentative="1">
+      <w:start w:val="1"/>
+      <w:numFmt w:val="bullet"/>
+      <w:lvlText w:val="o"/>
+      <w:lvlJc w:val="left"/>
+      <w:pPr>
+        <w:ind w:left="3600" w:hanging="360"/>
+      </w:pPr>
+      <w:rPr>
+        <w:rFonts w:ascii="Courier New" w:hAnsi="Courier New" w:cs="Courier New" w:hint="default"/>
+      </w:rPr>
+    </w:lvl>
+    <w:lvl w:ilvl="5" w:tplc="04090005" w:tentative="1">
+      <w:start w:val="1"/>
+      <w:numFmt w:val="bullet"/>
+      <w:lvlText w:val=""/>
+      <w:lvlJc w:val="left"/>
+      <w:pPr>
+        <w:ind w:left="4320" w:hanging="360"/>
+      </w:pPr>
+      <w:rPr>
+        <w:rFonts w:ascii="Wingdings" w:hAnsi="Wingdings" w:hint="default"/>
+      </w:rPr>
+    </w:lvl>
+    <w:lvl w:ilvl="6" w:tplc="04090001" w:tentative="1">
+      <w:start w:val="1"/>
+      <w:numFmt w:val="bullet"/>
+      <w:lvlText w:val=""/>
+      <w:lvlJc w:val="left"/>
+      <w:pPr>
+        <w:ind w:left="5040" w:hanging="360"/>
+      </w:pPr>
+      <w:rPr>
+        <w:rFonts w:ascii="Symbol" w:hAnsi="Symbol" w:hint="default"/>
+      </w:rPr>
+    </w:lvl>
+    <w:lvl w:ilvl="7" w:tplc="04090003" w:tentative="1">
+      <w:start w:val="1"/>
+      <w:numFmt w:val="bullet"/>
+      <w:lvlText w:val="o"/>
+      <w:lvlJc w:val="left"/>
+      <w:pPr>
+        <w:ind w:left="5760" w:hanging="360"/>
+      </w:pPr>
+      <w:rPr>
+        <w:rFonts w:ascii="Courier New" w:hAnsi="Courier New" w:cs="Courier New" w:hint="default"/>
+      </w:rPr>
+    </w:lvl>
+    <w:lvl w:ilvl="8" w:tplc="04090005" w:tentative="1">
+      <w:start w:val="1"/>
+      <w:numFmt w:val="bullet"/>
+      <w:lvlText w:val=""/>
+      <w:lvlJc w:val="left"/>
+      <w:pPr>
+        <w:ind w:left="6480" w:hanging="360"/>
+      </w:pPr>
+      <w:rPr>
+        <w:rFonts w:ascii="Wingdings" w:hAnsi="Wingdings" w:hint="default"/>
+      </w:rPr>
+    </w:lvl>
+  </w:abstractNum>
+  <w:num w:numId="1" w16cid:durableId="1035544936">
+    <w:abstractNumId w:val="0"/>
+  </w:num>
+</w:numbering>
 </file>
 
 <file path=word/styles.xml><?xml version="1.0" encoding="utf-8"?>
@@ -1238,6 +1576,7 @@
   <w:style w:type="character" w:default="1" w:styleId="a0">
     <w:name w:val="Default Paragraph Font"/>
     <w:uiPriority w:val="1"/>
+    <w:semiHidden/>
     <w:unhideWhenUsed/>
   </w:style>
   <w:style w:type="table" w:default="1" w:styleId="a1">
@@ -1549,6 +1888,29 @@
       <w:smallCaps/>
       <w:color w:val="0F4761" w:themeColor="accent1" w:themeShade="BF"/>
       <w:spacing w:val="5"/>
+    </w:rPr>
+  </w:style>
+  <w:style w:type="character" w:styleId="Hyperlink">
+    <w:name w:val="Hyperlink"/>
+    <w:basedOn w:val="a0"/>
+    <w:uiPriority w:val="99"/>
+    <w:unhideWhenUsed/>
+    <w:rsid w:val="009B0C9C"/>
+    <w:rPr>
+      <w:color w:val="467886" w:themeColor="hyperlink"/>
+      <w:u w:val="single"/>
+    </w:rPr>
+  </w:style>
+  <w:style w:type="character" w:styleId="ae">
+    <w:name w:val="Unresolved Mention"/>
+    <w:basedOn w:val="a0"/>
+    <w:uiPriority w:val="99"/>
+    <w:semiHidden/>
+    <w:unhideWhenUsed/>
+    <w:rsid w:val="009B0C9C"/>
+    <w:rPr>
+      <w:color w:val="605E5C"/>
+      <w:shd w:val="clear" w:color="auto" w:fill="E1DFDD"/>
     </w:rPr>
   </w:style>
 </w:styles>

</xml_diff>

<commit_message>
The New_York_Flankees THM challenge was finished!!!
</commit_message>
<xml_diff>
--- a/THM_challenges/Medium/New York Flankees/New_York_Flankees_Solution_Documentation.docx
+++ b/THM_challenges/Medium/New York Flankees/New_York_Flankees_Solution_Documentation.docx
@@ -425,15 +425,7 @@
     </w:p>
     <w:p>
       <w:r>
-        <w:t xml:space="preserve">I understood that there are 2 problems that should be </w:t>
-      </w:r>
-      <w:proofErr w:type="gramStart"/>
-      <w:r>
-        <w:t>fix</w:t>
-      </w:r>
-      <w:proofErr w:type="gramEnd"/>
-      <w:r>
-        <w:t xml:space="preserve"> to make the program work</w:t>
+        <w:t>I understood that there are 2 problems that should be fix to make the program work</w:t>
       </w:r>
     </w:p>
     <w:p>
@@ -500,15 +492,7 @@
         <w:t xml:space="preserve">I should complete this function in order to make it return the authentication token. I tried to enter the full path </w:t>
       </w:r>
       <w:r>
-        <w:t xml:space="preserve">provided by the function which returned </w:t>
-      </w:r>
-      <w:proofErr w:type="gramStart"/>
-      <w:r>
-        <w:t>my this</w:t>
-      </w:r>
-      <w:proofErr w:type="gramEnd"/>
-      <w:r>
-        <w:t xml:space="preserve"> message:</w:t>
+        <w:t>provided by the function which returned my this message:</w:t>
       </w:r>
     </w:p>
     <w:p>
@@ -841,6 +825,1076 @@
         <w:t xml:space="preserve"> very good.</w:t>
       </w:r>
     </w:p>
+    <w:p>
+      <w:r>
+        <w:t>So,</w:t>
+      </w:r>
+      <w:r>
+        <w:t xml:space="preserve"> I used this command in order to execute the oracle padding attack:</w:t>
+      </w:r>
+    </w:p>
+    <w:p>
+      <w:r>
+        <w:rPr>
+          <w:noProof/>
+        </w:rPr>
+        <w:drawing>
+          <wp:inline distT="0" distB="0" distL="0" distR="0" wp14:anchorId="15E23C8A" wp14:editId="26954453">
+            <wp:extent cx="7556500" cy="612775"/>
+            <wp:effectExtent l="0" t="0" r="6350" b="0"/>
+            <wp:docPr id="1850940753" name="תמונה 1"/>
+            <wp:cNvGraphicFramePr>
+              <a:graphicFrameLocks xmlns:a="http://schemas.openxmlformats.org/drawingml/2006/main" noChangeAspect="1"/>
+            </wp:cNvGraphicFramePr>
+            <a:graphic xmlns:a="http://schemas.openxmlformats.org/drawingml/2006/main">
+              <a:graphicData uri="http://schemas.openxmlformats.org/drawingml/2006/picture">
+                <pic:pic xmlns:pic="http://schemas.openxmlformats.org/drawingml/2006/picture">
+                  <pic:nvPicPr>
+                    <pic:cNvPr id="1850940753" name=""/>
+                    <pic:cNvPicPr/>
+                  </pic:nvPicPr>
+                  <pic:blipFill>
+                    <a:blip r:embed="rId14"/>
+                    <a:stretch>
+                      <a:fillRect/>
+                    </a:stretch>
+                  </pic:blipFill>
+                  <pic:spPr>
+                    <a:xfrm>
+                      <a:off x="0" y="0"/>
+                      <a:ext cx="7556500" cy="612775"/>
+                    </a:xfrm>
+                    <a:prstGeom prst="rect">
+                      <a:avLst/>
+                    </a:prstGeom>
+                  </pic:spPr>
+                </pic:pic>
+              </a:graphicData>
+            </a:graphic>
+          </wp:inline>
+        </w:drawing>
+      </w:r>
+    </w:p>
+    <w:p>
+      <w:r>
+        <w:t>The results showed me the decrypted message that was hidden inside the encrypted token.</w:t>
+      </w:r>
+      <w:r>
+        <w:t xml:space="preserve"> From this message I found out the credentials “</w:t>
+      </w:r>
+      <w:r>
+        <w:rPr>
+          <w:color w:val="00B050"/>
+        </w:rPr>
+        <w:t>stefan1197</w:t>
+      </w:r>
+      <w:r>
+        <w:t>:</w:t>
+      </w:r>
+      <w:r>
+        <w:rPr>
+          <w:color w:val="215E99" w:themeColor="text2" w:themeTint="BF"/>
+        </w:rPr>
+        <w:t>ebb2B76@62#f??7cA6B76@6!@62#f6dacd2599</w:t>
+      </w:r>
+      <w:r>
+        <w:t xml:space="preserve">” which </w:t>
+      </w:r>
+      <w:r>
+        <w:t xml:space="preserve">is the </w:t>
+      </w:r>
+      <w:r>
+        <w:t xml:space="preserve">answer </w:t>
+      </w:r>
+      <w:r>
+        <w:t xml:space="preserve">to </w:t>
+      </w:r>
+      <w:r>
+        <w:t>the first question in the challenge page</w:t>
+      </w:r>
+      <w:r>
+        <w:t>!</w:t>
+      </w:r>
+    </w:p>
+    <w:p>
+      <w:r>
+        <w:t xml:space="preserve">I continued to the </w:t>
+      </w:r>
+      <w:r>
+        <w:t xml:space="preserve">next step by login to the website with these credentials which led me </w:t>
+      </w:r>
+      <w:r>
+        <w:t>back to the index.html page</w:t>
+      </w:r>
+      <w:r>
+        <w:t xml:space="preserve"> as logged in </w:t>
+      </w:r>
+      <w:r>
+        <w:t>user</w:t>
+      </w:r>
+      <w:r>
+        <w:t>.</w:t>
+      </w:r>
+    </w:p>
+    <w:p>
+      <w:r>
+        <w:t xml:space="preserve">I noticed a small difference in this page because the top right cornet button was changed from “Admin Login” to this </w:t>
+      </w:r>
+      <w:r>
+        <w:t>button:</w:t>
+      </w:r>
+    </w:p>
+    <w:p>
+      <w:r>
+        <w:rPr>
+          <w:noProof/>
+        </w:rPr>
+        <w:lastRenderedPageBreak/>
+        <w:drawing>
+          <wp:inline distT="0" distB="0" distL="0" distR="0" wp14:anchorId="11A42B4D" wp14:editId="4DD5BB07">
+            <wp:extent cx="1333616" cy="598222"/>
+            <wp:effectExtent l="0" t="0" r="0" b="0"/>
+            <wp:docPr id="288252780" name="תמונה 1" descr="תמונה שמכילה צילום מסך, גופן, טקסט, לוגו&#10;&#10;תוכן בינה מלאכותית גנרטיבית עשוי להיות שגוי."/>
+            <wp:cNvGraphicFramePr>
+              <a:graphicFrameLocks xmlns:a="http://schemas.openxmlformats.org/drawingml/2006/main" noChangeAspect="1"/>
+            </wp:cNvGraphicFramePr>
+            <a:graphic xmlns:a="http://schemas.openxmlformats.org/drawingml/2006/main">
+              <a:graphicData uri="http://schemas.openxmlformats.org/drawingml/2006/picture">
+                <pic:pic xmlns:pic="http://schemas.openxmlformats.org/drawingml/2006/picture">
+                  <pic:nvPicPr>
+                    <pic:cNvPr id="288252780" name="תמונה 1" descr="תמונה שמכילה צילום מסך, גופן, טקסט, לוגו&#10;&#10;תוכן בינה מלאכותית גנרטיבית עשוי להיות שגוי."/>
+                    <pic:cNvPicPr/>
+                  </pic:nvPicPr>
+                  <pic:blipFill>
+                    <a:blip r:embed="rId15"/>
+                    <a:stretch>
+                      <a:fillRect/>
+                    </a:stretch>
+                  </pic:blipFill>
+                  <pic:spPr>
+                    <a:xfrm>
+                      <a:off x="0" y="0"/>
+                      <a:ext cx="1333616" cy="598222"/>
+                    </a:xfrm>
+                    <a:prstGeom prst="rect">
+                      <a:avLst/>
+                    </a:prstGeom>
+                  </pic:spPr>
+                </pic:pic>
+              </a:graphicData>
+            </a:graphic>
+          </wp:inline>
+        </w:drawing>
+      </w:r>
+    </w:p>
+    <w:p>
+      <w:r>
+        <w:t xml:space="preserve">I </w:t>
+      </w:r>
+      <w:r>
+        <w:t xml:space="preserve">clicked on </w:t>
+      </w:r>
+      <w:r>
+        <w:t>it,</w:t>
+      </w:r>
+      <w:r>
+        <w:t xml:space="preserve"> and</w:t>
+      </w:r>
+      <w:r>
+        <w:t xml:space="preserve"> it led me to this new page:</w:t>
+      </w:r>
+    </w:p>
+    <w:p>
+      <w:r>
+        <w:rPr>
+          <w:noProof/>
+        </w:rPr>
+        <w:drawing>
+          <wp:inline distT="0" distB="0" distL="0" distR="0" wp14:anchorId="4B140CB4" wp14:editId="7A6E7B7E">
+            <wp:extent cx="6439452" cy="2800350"/>
+            <wp:effectExtent l="0" t="0" r="0" b="0"/>
+            <wp:docPr id="459451999" name="תמונה 1" descr="תמונה שמכילה טקסט, צילום מסך, תוכנה, סמל מחשב&#10;&#10;תוכן בינה מלאכותית גנרטיבית עשוי להיות שגוי."/>
+            <wp:cNvGraphicFramePr>
+              <a:graphicFrameLocks xmlns:a="http://schemas.openxmlformats.org/drawingml/2006/main" noChangeAspect="1"/>
+            </wp:cNvGraphicFramePr>
+            <a:graphic xmlns:a="http://schemas.openxmlformats.org/drawingml/2006/main">
+              <a:graphicData uri="http://schemas.openxmlformats.org/drawingml/2006/picture">
+                <pic:pic xmlns:pic="http://schemas.openxmlformats.org/drawingml/2006/picture">
+                  <pic:nvPicPr>
+                    <pic:cNvPr id="459451999" name="תמונה 1" descr="תמונה שמכילה טקסט, צילום מסך, תוכנה, סמל מחשב&#10;&#10;תוכן בינה מלאכותית גנרטיבית עשוי להיות שגוי."/>
+                    <pic:cNvPicPr/>
+                  </pic:nvPicPr>
+                  <pic:blipFill>
+                    <a:blip r:embed="rId16"/>
+                    <a:stretch>
+                      <a:fillRect/>
+                    </a:stretch>
+                  </pic:blipFill>
+                  <pic:spPr>
+                    <a:xfrm>
+                      <a:off x="0" y="0"/>
+                      <a:ext cx="6446328" cy="2803340"/>
+                    </a:xfrm>
+                    <a:prstGeom prst="rect">
+                      <a:avLst/>
+                    </a:prstGeom>
+                  </pic:spPr>
+                </pic:pic>
+              </a:graphicData>
+            </a:graphic>
+          </wp:inline>
+        </w:drawing>
+      </w:r>
+    </w:p>
+    <w:p>
+      <w:r>
+        <w:t>Here I found the flag that appears on the admin panel as the challenge require</w:t>
+      </w:r>
+      <w:r>
+        <w:t>d.</w:t>
+      </w:r>
+    </w:p>
+    <w:p>
+      <w:r>
+        <w:t xml:space="preserve">I saw that this is a command execution </w:t>
+      </w:r>
+      <w:r>
+        <w:t>page,</w:t>
+      </w:r>
+      <w:r>
+        <w:t xml:space="preserve"> so I tried to enter </w:t>
+      </w:r>
+      <w:r>
+        <w:t xml:space="preserve">some known </w:t>
+      </w:r>
+      <w:r>
+        <w:t>linux command</w:t>
+      </w:r>
+      <w:r>
+        <w:t>s</w:t>
+      </w:r>
+      <w:r>
+        <w:t xml:space="preserve"> and it </w:t>
+      </w:r>
+      <w:r>
+        <w:t xml:space="preserve">just return “OK” </w:t>
+      </w:r>
+      <w:r>
+        <w:t>but when I enter</w:t>
+      </w:r>
+      <w:r>
+        <w:t>ed command which doesn’t exist it returned nothing.</w:t>
+      </w:r>
+      <w:r>
+        <w:t xml:space="preserve"> I understood that it </w:t>
+      </w:r>
+      <w:r>
+        <w:t>most likely</w:t>
+      </w:r>
+      <w:r>
+        <w:t xml:space="preserve"> </w:t>
+      </w:r>
+      <w:r>
+        <w:t>executes</w:t>
+      </w:r>
+      <w:r>
+        <w:t xml:space="preserve"> the command but doesn’t print the results.</w:t>
+      </w:r>
+      <w:r>
+        <w:t xml:space="preserve"> This led me to establish a netcat reverse shell over the machine</w:t>
+      </w:r>
+      <w:r>
+        <w:t xml:space="preserve"> as usual but it failed. </w:t>
+      </w:r>
+    </w:p>
+    <w:p>
+      <w:r>
+        <w:t xml:space="preserve">I thought about another way to get a rev </w:t>
+      </w:r>
+      <w:r>
+        <w:t>shell,</w:t>
+      </w:r>
+      <w:r>
+        <w:t xml:space="preserve"> and I wanted to try do it by uploading a bash file(that contains a rev shell command) to the website machine using a local python server</w:t>
+      </w:r>
+      <w:r>
+        <w:t>:</w:t>
+      </w:r>
+    </w:p>
+    <w:p>
+      <w:r>
+        <w:rPr>
+          <w:noProof/>
+        </w:rPr>
+        <w:drawing>
+          <wp:inline distT="0" distB="0" distL="0" distR="0" wp14:anchorId="00A7A68B" wp14:editId="3AACDF43">
+            <wp:extent cx="1771804" cy="666808"/>
+            <wp:effectExtent l="0" t="0" r="0" b="0"/>
+            <wp:docPr id="1116660891" name="תמונה 1"/>
+            <wp:cNvGraphicFramePr>
+              <a:graphicFrameLocks xmlns:a="http://schemas.openxmlformats.org/drawingml/2006/main" noChangeAspect="1"/>
+            </wp:cNvGraphicFramePr>
+            <a:graphic xmlns:a="http://schemas.openxmlformats.org/drawingml/2006/main">
+              <a:graphicData uri="http://schemas.openxmlformats.org/drawingml/2006/picture">
+                <pic:pic xmlns:pic="http://schemas.openxmlformats.org/drawingml/2006/picture">
+                  <pic:nvPicPr>
+                    <pic:cNvPr id="1116660891" name=""/>
+                    <pic:cNvPicPr/>
+                  </pic:nvPicPr>
+                  <pic:blipFill>
+                    <a:blip r:embed="rId17"/>
+                    <a:stretch>
+                      <a:fillRect/>
+                    </a:stretch>
+                  </pic:blipFill>
+                  <pic:spPr>
+                    <a:xfrm>
+                      <a:off x="0" y="0"/>
+                      <a:ext cx="1771804" cy="666808"/>
+                    </a:xfrm>
+                    <a:prstGeom prst="rect">
+                      <a:avLst/>
+                    </a:prstGeom>
+                  </pic:spPr>
+                </pic:pic>
+              </a:graphicData>
+            </a:graphic>
+          </wp:inline>
+        </w:drawing>
+      </w:r>
+    </w:p>
+    <w:p>
+      <w:r>
+        <w:rPr>
+          <w:noProof/>
+        </w:rPr>
+        <w:drawing>
+          <wp:inline distT="0" distB="0" distL="0" distR="0" wp14:anchorId="3DB484F9" wp14:editId="2CC005BE">
+            <wp:extent cx="3703641" cy="704911"/>
+            <wp:effectExtent l="0" t="0" r="0" b="0"/>
+            <wp:docPr id="1100949654" name="תמונה 1" descr="תמונה שמכילה טקסט, גופן, צילום מסך&#10;&#10;תוכן בינה מלאכותית גנרטיבית עשוי להיות שגוי."/>
+            <wp:cNvGraphicFramePr>
+              <a:graphicFrameLocks xmlns:a="http://schemas.openxmlformats.org/drawingml/2006/main" noChangeAspect="1"/>
+            </wp:cNvGraphicFramePr>
+            <a:graphic xmlns:a="http://schemas.openxmlformats.org/drawingml/2006/main">
+              <a:graphicData uri="http://schemas.openxmlformats.org/drawingml/2006/picture">
+                <pic:pic xmlns:pic="http://schemas.openxmlformats.org/drawingml/2006/picture">
+                  <pic:nvPicPr>
+                    <pic:cNvPr id="1100949654" name="תמונה 1" descr="תמונה שמכילה טקסט, גופן, צילום מסך&#10;&#10;תוכן בינה מלאכותית גנרטיבית עשוי להיות שגוי."/>
+                    <pic:cNvPicPr/>
+                  </pic:nvPicPr>
+                  <pic:blipFill>
+                    <a:blip r:embed="rId18"/>
+                    <a:stretch>
+                      <a:fillRect/>
+                    </a:stretch>
+                  </pic:blipFill>
+                  <pic:spPr>
+                    <a:xfrm>
+                      <a:off x="0" y="0"/>
+                      <a:ext cx="3703641" cy="704911"/>
+                    </a:xfrm>
+                    <a:prstGeom prst="rect">
+                      <a:avLst/>
+                    </a:prstGeom>
+                  </pic:spPr>
+                </pic:pic>
+              </a:graphicData>
+            </a:graphic>
+          </wp:inline>
+        </w:drawing>
+      </w:r>
+    </w:p>
+    <w:p>
+      <w:r>
+        <w:t xml:space="preserve">I created a bash file named “rev_shell.sh” that will connect to the nc listener </w:t>
+      </w:r>
+      <w:r>
+        <w:t xml:space="preserve">when it </w:t>
+      </w:r>
+      <w:r>
+        <w:t>gets</w:t>
+      </w:r>
+      <w:r>
+        <w:t xml:space="preserve"> executed:</w:t>
+      </w:r>
+    </w:p>
+    <w:p>
+      <w:r>
+        <w:rPr>
+          <w:noProof/>
+        </w:rPr>
+        <w:drawing>
+          <wp:inline distT="0" distB="0" distL="0" distR="0" wp14:anchorId="14E85D07" wp14:editId="564CB7F7">
+            <wp:extent cx="2495766" cy="400085"/>
+            <wp:effectExtent l="0" t="0" r="0" b="0"/>
+            <wp:docPr id="1537475128" name="תמונה 1" descr="תמונה שמכילה טקסט, גופן, צילום מסך, קו&#10;&#10;תוכן בינה מלאכותית גנרטיבית עשוי להיות שגוי."/>
+            <wp:cNvGraphicFramePr>
+              <a:graphicFrameLocks xmlns:a="http://schemas.openxmlformats.org/drawingml/2006/main" noChangeAspect="1"/>
+            </wp:cNvGraphicFramePr>
+            <a:graphic xmlns:a="http://schemas.openxmlformats.org/drawingml/2006/main">
+              <a:graphicData uri="http://schemas.openxmlformats.org/drawingml/2006/picture">
+                <pic:pic xmlns:pic="http://schemas.openxmlformats.org/drawingml/2006/picture">
+                  <pic:nvPicPr>
+                    <pic:cNvPr id="1537475128" name="תמונה 1" descr="תמונה שמכילה טקסט, גופן, צילום מסך, קו&#10;&#10;תוכן בינה מלאכותית גנרטיבית עשוי להיות שגוי."/>
+                    <pic:cNvPicPr/>
+                  </pic:nvPicPr>
+                  <pic:blipFill>
+                    <a:blip r:embed="rId19"/>
+                    <a:stretch>
+                      <a:fillRect/>
+                    </a:stretch>
+                  </pic:blipFill>
+                  <pic:spPr>
+                    <a:xfrm>
+                      <a:off x="0" y="0"/>
+                      <a:ext cx="2495766" cy="400085"/>
+                    </a:xfrm>
+                    <a:prstGeom prst="rect">
+                      <a:avLst/>
+                    </a:prstGeom>
+                  </pic:spPr>
+                </pic:pic>
+              </a:graphicData>
+            </a:graphic>
+          </wp:inline>
+        </w:drawing>
+      </w:r>
+    </w:p>
+    <w:p>
+      <w:r>
+        <w:rPr>
+          <w:noProof/>
+        </w:rPr>
+        <w:drawing>
+          <wp:inline distT="0" distB="0" distL="0" distR="0" wp14:anchorId="57DECD83" wp14:editId="39C79FD0">
+            <wp:extent cx="6413500" cy="1394802"/>
+            <wp:effectExtent l="0" t="0" r="6350" b="0"/>
+            <wp:docPr id="1757319029" name="תמונה 1"/>
+            <wp:cNvGraphicFramePr>
+              <a:graphicFrameLocks xmlns:a="http://schemas.openxmlformats.org/drawingml/2006/main" noChangeAspect="1"/>
+            </wp:cNvGraphicFramePr>
+            <a:graphic xmlns:a="http://schemas.openxmlformats.org/drawingml/2006/main">
+              <a:graphicData uri="http://schemas.openxmlformats.org/drawingml/2006/picture">
+                <pic:pic xmlns:pic="http://schemas.openxmlformats.org/drawingml/2006/picture">
+                  <pic:nvPicPr>
+                    <pic:cNvPr id="1757319029" name=""/>
+                    <pic:cNvPicPr/>
+                  </pic:nvPicPr>
+                  <pic:blipFill>
+                    <a:blip r:embed="rId20"/>
+                    <a:stretch>
+                      <a:fillRect/>
+                    </a:stretch>
+                  </pic:blipFill>
+                  <pic:spPr>
+                    <a:xfrm>
+                      <a:off x="0" y="0"/>
+                      <a:ext cx="6427367" cy="1397818"/>
+                    </a:xfrm>
+                    <a:prstGeom prst="rect">
+                      <a:avLst/>
+                    </a:prstGeom>
+                  </pic:spPr>
+                </pic:pic>
+              </a:graphicData>
+            </a:graphic>
+          </wp:inline>
+        </w:drawing>
+      </w:r>
+    </w:p>
+    <w:p>
+      <w:r>
+        <w:lastRenderedPageBreak/>
+        <w:t xml:space="preserve">Now </w:t>
+      </w:r>
+      <w:r>
+        <w:t>the file has been transferred to the target machine:</w:t>
+      </w:r>
+    </w:p>
+    <w:p>
+      <w:r>
+        <w:rPr>
+          <w:noProof/>
+        </w:rPr>
+        <w:drawing>
+          <wp:inline distT="0" distB="0" distL="0" distR="0" wp14:anchorId="7B9F697A" wp14:editId="2E6A070E">
+            <wp:extent cx="6199407" cy="769687"/>
+            <wp:effectExtent l="0" t="0" r="0" b="0"/>
+            <wp:docPr id="727055784" name="תמונה 1" descr="תמונה שמכילה צילום מסך, טקסט, גופן&#10;&#10;תוכן בינה מלאכותית גנרטיבית עשוי להיות שגוי."/>
+            <wp:cNvGraphicFramePr>
+              <a:graphicFrameLocks xmlns:a="http://schemas.openxmlformats.org/drawingml/2006/main" noChangeAspect="1"/>
+            </wp:cNvGraphicFramePr>
+            <a:graphic xmlns:a="http://schemas.openxmlformats.org/drawingml/2006/main">
+              <a:graphicData uri="http://schemas.openxmlformats.org/drawingml/2006/picture">
+                <pic:pic xmlns:pic="http://schemas.openxmlformats.org/drawingml/2006/picture">
+                  <pic:nvPicPr>
+                    <pic:cNvPr id="727055784" name="תמונה 1" descr="תמונה שמכילה צילום מסך, טקסט, גופן&#10;&#10;תוכן בינה מלאכותית גנרטיבית עשוי להיות שגוי."/>
+                    <pic:cNvPicPr/>
+                  </pic:nvPicPr>
+                  <pic:blipFill>
+                    <a:blip r:embed="rId21"/>
+                    <a:stretch>
+                      <a:fillRect/>
+                    </a:stretch>
+                  </pic:blipFill>
+                  <pic:spPr>
+                    <a:xfrm>
+                      <a:off x="0" y="0"/>
+                      <a:ext cx="6199407" cy="769687"/>
+                    </a:xfrm>
+                    <a:prstGeom prst="rect">
+                      <a:avLst/>
+                    </a:prstGeom>
+                  </pic:spPr>
+                </pic:pic>
+              </a:graphicData>
+            </a:graphic>
+          </wp:inline>
+        </w:drawing>
+      </w:r>
+    </w:p>
+    <w:p>
+      <w:r>
+        <w:t>But</w:t>
+      </w:r>
+      <w:r>
+        <w:t xml:space="preserve"> </w:t>
+      </w:r>
+      <w:r>
+        <w:t>before I executed it I lowered the permission of this file:</w:t>
+      </w:r>
+    </w:p>
+    <w:p>
+      <w:r>
+        <w:rPr>
+          <w:noProof/>
+        </w:rPr>
+        <w:drawing>
+          <wp:inline distT="0" distB="0" distL="0" distR="0" wp14:anchorId="5474E76B" wp14:editId="6C68B9BE">
+            <wp:extent cx="7556500" cy="1848485"/>
+            <wp:effectExtent l="0" t="0" r="6350" b="0"/>
+            <wp:docPr id="1674284641" name="תמונה 1"/>
+            <wp:cNvGraphicFramePr>
+              <a:graphicFrameLocks xmlns:a="http://schemas.openxmlformats.org/drawingml/2006/main" noChangeAspect="1"/>
+            </wp:cNvGraphicFramePr>
+            <a:graphic xmlns:a="http://schemas.openxmlformats.org/drawingml/2006/main">
+              <a:graphicData uri="http://schemas.openxmlformats.org/drawingml/2006/picture">
+                <pic:pic xmlns:pic="http://schemas.openxmlformats.org/drawingml/2006/picture">
+                  <pic:nvPicPr>
+                    <pic:cNvPr id="1674284641" name=""/>
+                    <pic:cNvPicPr/>
+                  </pic:nvPicPr>
+                  <pic:blipFill>
+                    <a:blip r:embed="rId22"/>
+                    <a:stretch>
+                      <a:fillRect/>
+                    </a:stretch>
+                  </pic:blipFill>
+                  <pic:spPr>
+                    <a:xfrm>
+                      <a:off x="0" y="0"/>
+                      <a:ext cx="7556500" cy="1848485"/>
+                    </a:xfrm>
+                    <a:prstGeom prst="rect">
+                      <a:avLst/>
+                    </a:prstGeom>
+                  </pic:spPr>
+                </pic:pic>
+              </a:graphicData>
+            </a:graphic>
+          </wp:inline>
+        </w:drawing>
+      </w:r>
+    </w:p>
+    <w:p>
+      <w:r>
+        <w:t>And I executed the file:</w:t>
+      </w:r>
+    </w:p>
+    <w:p>
+      <w:r>
+        <w:rPr>
+          <w:noProof/>
+        </w:rPr>
+        <w:drawing>
+          <wp:inline distT="0" distB="0" distL="0" distR="0" wp14:anchorId="545E32AB" wp14:editId="3B6C6F95">
+            <wp:extent cx="7556500" cy="1688465"/>
+            <wp:effectExtent l="0" t="0" r="6350" b="6985"/>
+            <wp:docPr id="1251784612" name="תמונה 1" descr="תמונה שמכילה טקסט, צילום מסך, גופן, קו&#10;&#10;תוכן בינה מלאכותית גנרטיבית עשוי להיות שגוי."/>
+            <wp:cNvGraphicFramePr>
+              <a:graphicFrameLocks xmlns:a="http://schemas.openxmlformats.org/drawingml/2006/main" noChangeAspect="1"/>
+            </wp:cNvGraphicFramePr>
+            <a:graphic xmlns:a="http://schemas.openxmlformats.org/drawingml/2006/main">
+              <a:graphicData uri="http://schemas.openxmlformats.org/drawingml/2006/picture">
+                <pic:pic xmlns:pic="http://schemas.openxmlformats.org/drawingml/2006/picture">
+                  <pic:nvPicPr>
+                    <pic:cNvPr id="1251784612" name="תמונה 1" descr="תמונה שמכילה טקסט, צילום מסך, גופן, קו&#10;&#10;תוכן בינה מלאכותית גנרטיבית עשוי להיות שגוי."/>
+                    <pic:cNvPicPr/>
+                  </pic:nvPicPr>
+                  <pic:blipFill>
+                    <a:blip r:embed="rId23"/>
+                    <a:stretch>
+                      <a:fillRect/>
+                    </a:stretch>
+                  </pic:blipFill>
+                  <pic:spPr>
+                    <a:xfrm>
+                      <a:off x="0" y="0"/>
+                      <a:ext cx="7556500" cy="1688465"/>
+                    </a:xfrm>
+                    <a:prstGeom prst="rect">
+                      <a:avLst/>
+                    </a:prstGeom>
+                  </pic:spPr>
+                </pic:pic>
+              </a:graphicData>
+            </a:graphic>
+          </wp:inline>
+        </w:drawing>
+      </w:r>
+    </w:p>
+    <w:p>
+      <w:r>
+        <w:t>Now when I returned to the nc listener I got the rev shell.</w:t>
+      </w:r>
+    </w:p>
+    <w:p>
+      <w:r>
+        <w:rPr>
+          <w:noProof/>
+        </w:rPr>
+        <w:drawing>
+          <wp:inline distT="0" distB="0" distL="0" distR="0" wp14:anchorId="6D2630CE" wp14:editId="5B541180">
+            <wp:extent cx="3772227" cy="1066892"/>
+            <wp:effectExtent l="0" t="0" r="0" b="0"/>
+            <wp:docPr id="709372431" name="תמונה 1" descr="תמונה שמכילה טקסט, צילום מסך, גופן&#10;&#10;תוכן בינה מלאכותית גנרטיבית עשוי להיות שגוי."/>
+            <wp:cNvGraphicFramePr>
+              <a:graphicFrameLocks xmlns:a="http://schemas.openxmlformats.org/drawingml/2006/main" noChangeAspect="1"/>
+            </wp:cNvGraphicFramePr>
+            <a:graphic xmlns:a="http://schemas.openxmlformats.org/drawingml/2006/main">
+              <a:graphicData uri="http://schemas.openxmlformats.org/drawingml/2006/picture">
+                <pic:pic xmlns:pic="http://schemas.openxmlformats.org/drawingml/2006/picture">
+                  <pic:nvPicPr>
+                    <pic:cNvPr id="709372431" name="תמונה 1" descr="תמונה שמכילה טקסט, צילום מסך, גופן&#10;&#10;תוכן בינה מלאכותית גנרטיבית עשוי להיות שגוי."/>
+                    <pic:cNvPicPr/>
+                  </pic:nvPicPr>
+                  <pic:blipFill>
+                    <a:blip r:embed="rId24"/>
+                    <a:stretch>
+                      <a:fillRect/>
+                    </a:stretch>
+                  </pic:blipFill>
+                  <pic:spPr>
+                    <a:xfrm>
+                      <a:off x="0" y="0"/>
+                      <a:ext cx="3772227" cy="1066892"/>
+                    </a:xfrm>
+                    <a:prstGeom prst="rect">
+                      <a:avLst/>
+                    </a:prstGeom>
+                  </pic:spPr>
+                </pic:pic>
+              </a:graphicData>
+            </a:graphic>
+          </wp:inline>
+        </w:drawing>
+      </w:r>
+    </w:p>
+    <w:p>
+      <w:r>
+        <w:t>At this point, before I continued, I wanted to get a full tty in order to make</w:t>
+      </w:r>
+      <w:r>
+        <w:t xml:space="preserve"> the</w:t>
+      </w:r>
+      <w:r>
+        <w:t xml:space="preserve"> </w:t>
+      </w:r>
+      <w:r>
+        <w:t>shell</w:t>
+      </w:r>
+      <w:r>
+        <w:t xml:space="preserve"> more convenient</w:t>
+      </w:r>
+      <w:r>
+        <w:t xml:space="preserve"> to use.</w:t>
+      </w:r>
+    </w:p>
+    <w:p>
+      <w:r>
+        <w:t>I used the “id” command to understand which user am I and I found that I’m root:</w:t>
+      </w:r>
+    </w:p>
+    <w:p>
+      <w:r>
+        <w:rPr>
+          <w:noProof/>
+        </w:rPr>
+        <w:drawing>
+          <wp:inline distT="0" distB="0" distL="0" distR="0" wp14:anchorId="6C0601A5" wp14:editId="184C384B">
+            <wp:extent cx="2438611" cy="400085"/>
+            <wp:effectExtent l="0" t="0" r="0" b="0"/>
+            <wp:docPr id="340369612" name="תמונה 1" descr="תמונה שמכילה טקסט, גופן, צילום מסך&#10;&#10;תוכן בינה מלאכותית גנרטיבית עשוי להיות שגוי."/>
+            <wp:cNvGraphicFramePr>
+              <a:graphicFrameLocks xmlns:a="http://schemas.openxmlformats.org/drawingml/2006/main" noChangeAspect="1"/>
+            </wp:cNvGraphicFramePr>
+            <a:graphic xmlns:a="http://schemas.openxmlformats.org/drawingml/2006/main">
+              <a:graphicData uri="http://schemas.openxmlformats.org/drawingml/2006/picture">
+                <pic:pic xmlns:pic="http://schemas.openxmlformats.org/drawingml/2006/picture">
+                  <pic:nvPicPr>
+                    <pic:cNvPr id="340369612" name="תמונה 1" descr="תמונה שמכילה טקסט, גופן, צילום מסך&#10;&#10;תוכן בינה מלאכותית גנרטיבית עשוי להיות שגוי."/>
+                    <pic:cNvPicPr/>
+                  </pic:nvPicPr>
+                  <pic:blipFill>
+                    <a:blip r:embed="rId25"/>
+                    <a:stretch>
+                      <a:fillRect/>
+                    </a:stretch>
+                  </pic:blipFill>
+                  <pic:spPr>
+                    <a:xfrm>
+                      <a:off x="0" y="0"/>
+                      <a:ext cx="2438611" cy="400085"/>
+                    </a:xfrm>
+                    <a:prstGeom prst="rect">
+                      <a:avLst/>
+                    </a:prstGeom>
+                  </pic:spPr>
+                </pic:pic>
+              </a:graphicData>
+            </a:graphic>
+          </wp:inline>
+        </w:drawing>
+      </w:r>
+    </w:p>
+    <w:p>
+      <w:r>
+        <w:t xml:space="preserve">I </w:t>
+      </w:r>
+      <w:r>
+        <w:t xml:space="preserve">navigated </w:t>
+      </w:r>
+      <w:r>
+        <w:t xml:space="preserve">a bit </w:t>
+      </w:r>
+      <w:r>
+        <w:t>at the file system and found nothing, so I retuned to the challenge page and read t</w:t>
+      </w:r>
+      <w:r>
+        <w:t xml:space="preserve">ask number 3 again. I realized that it talks about containers which means </w:t>
+      </w:r>
+      <w:r>
+        <w:t>they are</w:t>
+      </w:r>
+      <w:r>
+        <w:t xml:space="preserve"> related</w:t>
+      </w:r>
+      <w:r>
+        <w:t xml:space="preserve"> to dockers</w:t>
+      </w:r>
+      <w:r>
+        <w:t>, so I</w:t>
+      </w:r>
+      <w:r>
+        <w:t xml:space="preserve"> entered this command to</w:t>
+      </w:r>
+      <w:r>
+        <w:t xml:space="preserve"> list</w:t>
+      </w:r>
+      <w:r>
+        <w:t xml:space="preserve"> all</w:t>
+      </w:r>
+      <w:r>
+        <w:t xml:space="preserve"> the docker containers </w:t>
+      </w:r>
+      <w:r>
+        <w:t>on t</w:t>
+      </w:r>
+      <w:r>
+        <w:t>he target machine</w:t>
+      </w:r>
+      <w:r>
+        <w:t>:</w:t>
+      </w:r>
+    </w:p>
+    <w:p>
+      <w:r>
+        <w:rPr>
+          <w:noProof/>
+        </w:rPr>
+        <w:drawing>
+          <wp:inline distT="0" distB="0" distL="0" distR="0" wp14:anchorId="680BD15B" wp14:editId="5CBF46F9">
+            <wp:extent cx="7556500" cy="416560"/>
+            <wp:effectExtent l="0" t="0" r="6350" b="2540"/>
+            <wp:docPr id="913382725" name="תמונה 1"/>
+            <wp:cNvGraphicFramePr>
+              <a:graphicFrameLocks xmlns:a="http://schemas.openxmlformats.org/drawingml/2006/main" noChangeAspect="1"/>
+            </wp:cNvGraphicFramePr>
+            <a:graphic xmlns:a="http://schemas.openxmlformats.org/drawingml/2006/main">
+              <a:graphicData uri="http://schemas.openxmlformats.org/drawingml/2006/picture">
+                <pic:pic xmlns:pic="http://schemas.openxmlformats.org/drawingml/2006/picture">
+                  <pic:nvPicPr>
+                    <pic:cNvPr id="913382725" name=""/>
+                    <pic:cNvPicPr/>
+                  </pic:nvPicPr>
+                  <pic:blipFill>
+                    <a:blip r:embed="rId26"/>
+                    <a:stretch>
+                      <a:fillRect/>
+                    </a:stretch>
+                  </pic:blipFill>
+                  <pic:spPr>
+                    <a:xfrm>
+                      <a:off x="0" y="0"/>
+                      <a:ext cx="7556500" cy="416560"/>
+                    </a:xfrm>
+                    <a:prstGeom prst="rect">
+                      <a:avLst/>
+                    </a:prstGeom>
+                  </pic:spPr>
+                </pic:pic>
+              </a:graphicData>
+            </a:graphic>
+          </wp:inline>
+        </w:drawing>
+      </w:r>
+    </w:p>
+    <w:p/>
+    <w:p>
+      <w:r>
+        <w:lastRenderedPageBreak/>
+        <w:t xml:space="preserve">I found that there is only 1 </w:t>
+      </w:r>
+      <w:r>
+        <w:t>container,</w:t>
+      </w:r>
+      <w:r>
+        <w:t xml:space="preserve"> and I saw that </w:t>
+      </w:r>
+      <w:r>
+        <w:t>its</w:t>
+      </w:r>
+      <w:r>
+        <w:t xml:space="preserve"> id appears next to the shell’s root </w:t>
+      </w:r>
+      <w:r>
+        <w:t>header,</w:t>
+      </w:r>
+      <w:r>
+        <w:t xml:space="preserve"> so I understood that I’m already in the container.</w:t>
+      </w:r>
+      <w:r>
+        <w:t xml:space="preserve"> </w:t>
+      </w:r>
+    </w:p>
+    <w:p>
+      <w:r>
+        <w:t xml:space="preserve">I </w:t>
+      </w:r>
+      <w:r>
+        <w:t>continue navigating and still found nothing, so I went to check for an</w:t>
+      </w:r>
+      <w:r>
+        <w:t>o</w:t>
+      </w:r>
+      <w:r>
+        <w:t>ther docker images</w:t>
+      </w:r>
+      <w:r>
+        <w:t>:</w:t>
+      </w:r>
+    </w:p>
+    <w:p>
+      <w:r>
+        <w:drawing>
+          <wp:inline distT="0" distB="0" distL="0" distR="0" wp14:anchorId="74CF0F5A" wp14:editId="16DAF69D">
+            <wp:extent cx="4503810" cy="769687"/>
+            <wp:effectExtent l="0" t="0" r="0" b="0"/>
+            <wp:docPr id="219785397" name="תמונה 1" descr="תמונה שמכילה טקסט, צילום מסך, גופן, מספר&#10;&#10;תוכן בינה מלאכותית גנרטיבית עשוי להיות שגוי."/>
+            <wp:cNvGraphicFramePr>
+              <a:graphicFrameLocks xmlns:a="http://schemas.openxmlformats.org/drawingml/2006/main" noChangeAspect="1"/>
+            </wp:cNvGraphicFramePr>
+            <a:graphic xmlns:a="http://schemas.openxmlformats.org/drawingml/2006/main">
+              <a:graphicData uri="http://schemas.openxmlformats.org/drawingml/2006/picture">
+                <pic:pic xmlns:pic="http://schemas.openxmlformats.org/drawingml/2006/picture">
+                  <pic:nvPicPr>
+                    <pic:cNvPr id="219785397" name="תמונה 1" descr="תמונה שמכילה טקסט, צילום מסך, גופן, מספר&#10;&#10;תוכן בינה מלאכותית גנרטיבית עשוי להיות שגוי."/>
+                    <pic:cNvPicPr/>
+                  </pic:nvPicPr>
+                  <pic:blipFill>
+                    <a:blip r:embed="rId27"/>
+                    <a:stretch>
+                      <a:fillRect/>
+                    </a:stretch>
+                  </pic:blipFill>
+                  <pic:spPr>
+                    <a:xfrm>
+                      <a:off x="0" y="0"/>
+                      <a:ext cx="4503810" cy="769687"/>
+                    </a:xfrm>
+                    <a:prstGeom prst="rect">
+                      <a:avLst/>
+                    </a:prstGeom>
+                  </pic:spPr>
+                </pic:pic>
+              </a:graphicData>
+            </a:graphic>
+          </wp:inline>
+        </w:drawing>
+      </w:r>
+    </w:p>
+    <w:p>
+      <w:r>
+        <w:t>I tried to connect to the first one, using this command, but it failed:</w:t>
+      </w:r>
+    </w:p>
+    <w:p>
+      <w:r>
+        <w:drawing>
+          <wp:inline distT="0" distB="0" distL="0" distR="0" wp14:anchorId="37A1A1E8" wp14:editId="4EACE708">
+            <wp:extent cx="7556500" cy="391795"/>
+            <wp:effectExtent l="0" t="0" r="6350" b="8255"/>
+            <wp:docPr id="13317505" name="תמונה 1"/>
+            <wp:cNvGraphicFramePr>
+              <a:graphicFrameLocks xmlns:a="http://schemas.openxmlformats.org/drawingml/2006/main" noChangeAspect="1"/>
+            </wp:cNvGraphicFramePr>
+            <a:graphic xmlns:a="http://schemas.openxmlformats.org/drawingml/2006/main">
+              <a:graphicData uri="http://schemas.openxmlformats.org/drawingml/2006/picture">
+                <pic:pic xmlns:pic="http://schemas.openxmlformats.org/drawingml/2006/picture">
+                  <pic:nvPicPr>
+                    <pic:cNvPr id="13317505" name=""/>
+                    <pic:cNvPicPr/>
+                  </pic:nvPicPr>
+                  <pic:blipFill>
+                    <a:blip r:embed="rId28"/>
+                    <a:stretch>
+                      <a:fillRect/>
+                    </a:stretch>
+                  </pic:blipFill>
+                  <pic:spPr>
+                    <a:xfrm>
+                      <a:off x="0" y="0"/>
+                      <a:ext cx="7556500" cy="391795"/>
+                    </a:xfrm>
+                    <a:prstGeom prst="rect">
+                      <a:avLst/>
+                    </a:prstGeom>
+                  </pic:spPr>
+                </pic:pic>
+              </a:graphicData>
+            </a:graphic>
+          </wp:inline>
+        </w:drawing>
+      </w:r>
+    </w:p>
+    <w:p>
+      <w:r>
+        <w:t>I tried with the second one and it succeeded</w:t>
+      </w:r>
+      <w:r>
+        <w:t>:</w:t>
+      </w:r>
+    </w:p>
+    <w:p>
+      <w:r>
+        <w:rPr>
+          <w:noProof/>
+        </w:rPr>
+        <w:drawing>
+          <wp:inline distT="0" distB="0" distL="0" distR="0" wp14:anchorId="7BD9A8FD" wp14:editId="7ECF45DE">
+            <wp:extent cx="5872480" cy="717035"/>
+            <wp:effectExtent l="0" t="0" r="0" b="6985"/>
+            <wp:docPr id="435738147" name="תמונה 1"/>
+            <wp:cNvGraphicFramePr>
+              <a:graphicFrameLocks xmlns:a="http://schemas.openxmlformats.org/drawingml/2006/main" noChangeAspect="1"/>
+            </wp:cNvGraphicFramePr>
+            <a:graphic xmlns:a="http://schemas.openxmlformats.org/drawingml/2006/main">
+              <a:graphicData uri="http://schemas.openxmlformats.org/drawingml/2006/picture">
+                <pic:pic xmlns:pic="http://schemas.openxmlformats.org/drawingml/2006/picture">
+                  <pic:nvPicPr>
+                    <pic:cNvPr id="435738147" name=""/>
+                    <pic:cNvPicPr/>
+                  </pic:nvPicPr>
+                  <pic:blipFill>
+                    <a:blip r:embed="rId29"/>
+                    <a:stretch>
+                      <a:fillRect/>
+                    </a:stretch>
+                  </pic:blipFill>
+                  <pic:spPr>
+                    <a:xfrm>
+                      <a:off x="0" y="0"/>
+                      <a:ext cx="5915919" cy="722339"/>
+                    </a:xfrm>
+                    <a:prstGeom prst="rect">
+                      <a:avLst/>
+                    </a:prstGeom>
+                  </pic:spPr>
+                </pic:pic>
+              </a:graphicData>
+            </a:graphic>
+          </wp:inline>
+        </w:drawing>
+      </w:r>
+    </w:p>
+    <w:p>
+      <w:r>
+        <w:t xml:space="preserve">Now I </w:t>
+      </w:r>
+      <w:r>
+        <w:t xml:space="preserve">searched for the flag, and I found </w:t>
+      </w:r>
+      <w:r>
+        <w:t>the last flag</w:t>
+      </w:r>
+      <w:r>
+        <w:t>:</w:t>
+      </w:r>
+    </w:p>
+    <w:p>
+      <w:r>
+        <w:rPr>
+          <w:noProof/>
+        </w:rPr>
+        <w:drawing>
+          <wp:inline distT="0" distB="0" distL="0" distR="0" wp14:anchorId="4CCCD2BA" wp14:editId="02A35DB8">
+            <wp:extent cx="7556500" cy="1449070"/>
+            <wp:effectExtent l="0" t="0" r="6350" b="0"/>
+            <wp:docPr id="48463801" name="תמונה 1"/>
+            <wp:cNvGraphicFramePr>
+              <a:graphicFrameLocks xmlns:a="http://schemas.openxmlformats.org/drawingml/2006/main" noChangeAspect="1"/>
+            </wp:cNvGraphicFramePr>
+            <a:graphic xmlns:a="http://schemas.openxmlformats.org/drawingml/2006/main">
+              <a:graphicData uri="http://schemas.openxmlformats.org/drawingml/2006/picture">
+                <pic:pic xmlns:pic="http://schemas.openxmlformats.org/drawingml/2006/picture">
+                  <pic:nvPicPr>
+                    <pic:cNvPr id="48463801" name=""/>
+                    <pic:cNvPicPr/>
+                  </pic:nvPicPr>
+                  <pic:blipFill>
+                    <a:blip r:embed="rId30"/>
+                    <a:stretch>
+                      <a:fillRect/>
+                    </a:stretch>
+                  </pic:blipFill>
+                  <pic:spPr>
+                    <a:xfrm>
+                      <a:off x="0" y="0"/>
+                      <a:ext cx="7556500" cy="1449070"/>
+                    </a:xfrm>
+                    <a:prstGeom prst="rect">
+                      <a:avLst/>
+                    </a:prstGeom>
+                  </pic:spPr>
+                </pic:pic>
+              </a:graphicData>
+            </a:graphic>
+          </wp:inline>
+        </w:drawing>
+      </w:r>
+    </w:p>
+    <w:p/>
     <w:p/>
     <w:sectPr>
       <w:pgSz w:w="12240" w:h="15840"/>

</xml_diff>

<commit_message>
The New York Flankees was finished
</commit_message>
<xml_diff>
--- a/THM_challenges/Medium/New York Flankees/New_York_Flankees_Solution_Documentation.docx
+++ b/THM_challenges/Medium/New York Flankees/New_York_Flankees_Solution_Documentation.docx
@@ -1579,22 +1579,64 @@
         <w:t xml:space="preserve">a bit </w:t>
       </w:r>
       <w:r>
-        <w:t>at the file system and found nothing, so I retuned to the challenge page and read t</w:t>
-      </w:r>
-      <w:r>
-        <w:t xml:space="preserve">ask number 3 again. I realized that it talks about containers which means </w:t>
-      </w:r>
-      <w:r>
-        <w:t>they are</w:t>
-      </w:r>
-      <w:r>
-        <w:t xml:space="preserve"> related</w:t>
-      </w:r>
-      <w:r>
-        <w:t xml:space="preserve"> to dockers</w:t>
-      </w:r>
-      <w:r>
-        <w:t>, so I</w:t>
+        <w:t xml:space="preserve">at the file system and found </w:t>
+      </w:r>
+      <w:r>
+        <w:t xml:space="preserve">the second flag in the </w:t>
+      </w:r>
+      <w:r>
+        <w:t>environment variables:</w:t>
+      </w:r>
+    </w:p>
+    <w:p>
+      <w:r>
+        <w:drawing>
+          <wp:inline distT="0" distB="0" distL="0" distR="0" wp14:anchorId="05B27A30" wp14:editId="380F3D05">
+            <wp:extent cx="2686050" cy="1047198"/>
+            <wp:effectExtent l="0" t="0" r="0" b="635"/>
+            <wp:docPr id="618444314" name="תמונה 1"/>
+            <wp:cNvGraphicFramePr>
+              <a:graphicFrameLocks xmlns:a="http://schemas.openxmlformats.org/drawingml/2006/main" noChangeAspect="1"/>
+            </wp:cNvGraphicFramePr>
+            <a:graphic xmlns:a="http://schemas.openxmlformats.org/drawingml/2006/main">
+              <a:graphicData uri="http://schemas.openxmlformats.org/drawingml/2006/picture">
+                <pic:pic xmlns:pic="http://schemas.openxmlformats.org/drawingml/2006/picture">
+                  <pic:nvPicPr>
+                    <pic:cNvPr id="618444314" name=""/>
+                    <pic:cNvPicPr/>
+                  </pic:nvPicPr>
+                  <pic:blipFill>
+                    <a:blip r:embed="rId26"/>
+                    <a:stretch>
+                      <a:fillRect/>
+                    </a:stretch>
+                  </pic:blipFill>
+                  <pic:spPr>
+                    <a:xfrm>
+                      <a:off x="0" y="0"/>
+                      <a:ext cx="2697275" cy="1051574"/>
+                    </a:xfrm>
+                    <a:prstGeom prst="rect">
+                      <a:avLst/>
+                    </a:prstGeom>
+                  </pic:spPr>
+                </pic:pic>
+              </a:graphicData>
+            </a:graphic>
+          </wp:inline>
+        </w:drawing>
+      </w:r>
+    </w:p>
+    <w:p>
+      <w:r>
+        <w:lastRenderedPageBreak/>
+        <w:t>Afterwards,</w:t>
+      </w:r>
+      <w:r>
+        <w:t xml:space="preserve"> </w:t>
+      </w:r>
+      <w:r>
+        <w:t>I</w:t>
       </w:r>
       <w:r>
         <w:t xml:space="preserve"> entered this command to</w:t>
@@ -1639,7 +1681,7 @@
                     <pic:cNvPicPr/>
                   </pic:nvPicPr>
                   <pic:blipFill>
-                    <a:blip r:embed="rId26"/>
+                    <a:blip r:embed="rId27"/>
                     <a:stretch>
                       <a:fillRect/>
                     </a:stretch>
@@ -1660,10 +1702,8 @@
         </w:drawing>
       </w:r>
     </w:p>
-    <w:p/>
-    <w:p>
-      <w:r>
-        <w:lastRenderedPageBreak/>
+    <w:p>
+      <w:r>
         <w:t xml:space="preserve">I found that there is only 1 </w:t>
       </w:r>
       <w:r>
@@ -1707,6 +1747,9 @@
     </w:p>
     <w:p>
       <w:r>
+        <w:rPr>
+          <w:noProof/>
+        </w:rPr>
         <w:drawing>
           <wp:inline distT="0" distB="0" distL="0" distR="0" wp14:anchorId="74CF0F5A" wp14:editId="16DAF69D">
             <wp:extent cx="4503810" cy="769687"/>
@@ -1723,7 +1766,7 @@
                     <pic:cNvPicPr/>
                   </pic:nvPicPr>
                   <pic:blipFill>
-                    <a:blip r:embed="rId27"/>
+                    <a:blip r:embed="rId28"/>
                     <a:stretch>
                       <a:fillRect/>
                     </a:stretch>
@@ -1751,6 +1794,9 @@
     </w:p>
     <w:p>
       <w:r>
+        <w:rPr>
+          <w:noProof/>
+        </w:rPr>
         <w:drawing>
           <wp:inline distT="0" distB="0" distL="0" distR="0" wp14:anchorId="37A1A1E8" wp14:editId="4EACE708">
             <wp:extent cx="7556500" cy="391795"/>
@@ -1767,7 +1813,7 @@
                     <pic:cNvPicPr/>
                   </pic:nvPicPr>
                   <pic:blipFill>
-                    <a:blip r:embed="rId28"/>
+                    <a:blip r:embed="rId29"/>
                     <a:stretch>
                       <a:fillRect/>
                     </a:stretch>
@@ -1817,7 +1863,7 @@
                     <pic:cNvPicPr/>
                   </pic:nvPicPr>
                   <pic:blipFill>
-                    <a:blip r:embed="rId29"/>
+                    <a:blip r:embed="rId30"/>
                     <a:stretch>
                       <a:fillRect/>
                     </a:stretch>
@@ -1843,10 +1889,16 @@
         <w:t xml:space="preserve">Now I </w:t>
       </w:r>
       <w:r>
-        <w:t xml:space="preserve">searched for the flag, and I found </w:t>
-      </w:r>
-      <w:r>
-        <w:t>the last flag</w:t>
+        <w:t>searched for the</w:t>
+      </w:r>
+      <w:r>
+        <w:t xml:space="preserve"> last</w:t>
+      </w:r>
+      <w:r>
+        <w:t xml:space="preserve"> flag, and I found</w:t>
+      </w:r>
+      <w:r>
+        <w:t xml:space="preserve"> it</w:t>
       </w:r>
       <w:r>
         <w:t>:</w:t>
@@ -1873,7 +1925,7 @@
                     <pic:cNvPicPr/>
                   </pic:nvPicPr>
                   <pic:blipFill>
-                    <a:blip r:embed="rId30"/>
+                    <a:blip r:embed="rId31"/>
                     <a:stretch>
                       <a:fillRect/>
                     </a:stretch>

</xml_diff>